<commit_message>
Fix orphaned/uncited references and complete Supplementary Materials list
Final QC pass found two real bugs:
- References 5 (DESeq2) and 6 (limma) were in the bibliography but never
  actually cited in the text -- limma was removed entirely (not used
  anywhere in this study's methodology, was leftover boilerplate), DESeq2
  now has a proper in-text citation at its first substantive mention
  (Methods 2.1). All subsequent references renumbered 6-10 accordingly;
  verified programmatically that every citation number now has exactly
  one matching reference entry and vice versa (no orphans, no missing).
- Supplementary Materials only listed source data for the primary
  analysis (results/11_*.csv); added the external_validation/results/
  CSVs that actually back Figure 5 and Section 3.5.

Co-Authored-By: Claude Sonnet 5 <noreply@anthropic.com>
</commit_message>
<xml_diff>
--- a/manuscript/manuscript.docx
+++ b/manuscript/manuscript.docx
@@ -290,7 +290,7 @@
           <w:sz w:val="22"/>
           <w:vertAlign w:val="superscript"/>
         </w:rPr>
-        <w:t>8</w:t>
+        <w:t>7</w:t>
       </w:r>
       <w:r>
         <w:t xml:space="preserve"> (GSE285614, bulk liver RNA-seq; GSE285615, liver scRNA-seq), originally deposited alongside</w:t>
@@ -303,7 +303,17 @@
         <w:t>1</w:t>
       </w:r>
       <w:r>
-        <w:t>. GSE285614 was deposited as two separate DESeq2 analyses, each with per-sample raw counts embedded alongside summary statistics: "HFD_TG_vs_WT" (16 samples: WT and Bcl2TG, chow and HFD; the "adipocyte-death axis") and "MKO_HFD_vs_WT_HFD" (18 samples: S100a8</w:t>
+        <w:t>. GSE285614 was deposited as two separate DESeq2</w:t>
+      </w:r>
+      <w:r>
+        <w:rPr>
+          <w:sz w:val="22"/>
+          <w:vertAlign w:val="superscript"/>
+        </w:rPr>
+        <w:t>5</w:t>
+      </w:r>
+      <w:r>
+        <w:t xml:space="preserve"> analyses, each with per-sample raw counts embedded alongside summary statistics: "HFD_TG_vs_WT" (16 samples: WT and Bcl2TG, chow and HFD; the "adipocyte-death axis") and "MKO_HFD_vs_WT_HFD" (18 samples: S100a8</w:t>
       </w:r>
       <w:r>
         <w:rPr>
@@ -755,7 +765,7 @@
           <w:sz w:val="22"/>
           <w:vertAlign w:val="superscript"/>
         </w:rPr>
-        <w:t>9</w:t>
+        <w:t>8</w:t>
       </w:r>
       <w:r>
         <w:t>.</w:t>
@@ -891,7 +901,7 @@
           <w:sz w:val="22"/>
           <w:vertAlign w:val="superscript"/>
         </w:rPr>
-        <w:t>7</w:t>
+        <w:t>6</w:t>
       </w:r>
       <w:r>
         <w:t xml:space="preserve"> was applied within each pre-specified comparison family (12 cell types, separately within axis 1's HFD validation cohort and within each diet of axis 2's MKO screen; 30 cell-type-by-gene-by-sample-subset combinations for the lipogenic-gene correlation analysis), and q &lt; 0.05 was used as the significance threshold for corrected results. Correlations between deconvolution scores and log</w:t>
@@ -923,7 +933,7 @@
           <w:sz w:val="22"/>
           <w:vertAlign w:val="superscript"/>
         </w:rPr>
-        <w:t>10</w:t>
+        <w:t>9</w:t>
       </w:r>
       <w:r>
         <w:t>, mouse liver non-parenchymal cells across a chow / 15-week high-fat-high-fructose-diet (NAFL) / 30-week (NASH) progression with true biological replicates (chow n = 6, NAFL n = 3, NASH n = 4 mice), reprocessed from raw counts and the authors' own coarse cell-type labels (Kupffer cell, monocyte/monocyte-derived macrophage, neutrophil; 23,198 myeloid cells), reclustered within the myeloid compartment (resolution = 0.6, 18 clusters); and (2) GSE156057 (Remmerie et al.</w:t>
@@ -933,7 +943,7 @@
           <w:sz w:val="22"/>
           <w:vertAlign w:val="superscript"/>
         </w:rPr>
-        <w:t>11</w:t>
+        <w:t>10</w:t>
       </w:r>
       <w:r>
         <w:t>), CD45+-sorted mouse liver immune cells across standard diet (SD) vs western diet (WD), 12/24/36-week timepoints (one sample per condition-timepoint -- pseudo-replicates across independent mice/times, not within-condition biological replicates), reclustered de novo (77,655 cells, resolution = 0.8, 40 clusters). For each dataset we determined whether any cluster matched the marker criteria and, where present, computed its proportion of CD45+/myeloid cells across conditions.</w:t>
@@ -2154,7 +2164,7 @@
           <w:sz w:val="22"/>
           <w:vertAlign w:val="superscript"/>
         </w:rPr>
-        <w:t>11</w:t>
+        <w:t>10</w:t>
       </w:r>
       <w:r>
         <w:t xml:space="preserve"> and related work: in the primary reference, S100A8hi_macrophage showed minimal Trem2 (0.9%) and Gpnmb (2.1%) positivity, while these markers were concentrated instead within the broader Macrophage_Kupffer compartment (Trem2 42.1%, Gpnmb 23.5%; Section 3.1). Combined with its transient, diet-reversible abundance pattern in GSE156057 (Section 3.5), this profile is more consistent with an early, acutely inflammatory, recently recruited monocyte-derived state responding to adipocyte death than with the chronically lipid-laden lipid-associated-macrophage phenotype that develops later in disease progression.</w:t>
@@ -2294,7 +2304,7 @@
     </w:p>
     <w:p>
       <w:r>
-        <w:t>Full result tables underlying all figures and in-text statistics are available in the code repository (Section 2.8): results/11_axis1_stats_full.csv (axis 1 validation), results/11_MKO_stats_full.csv (axis 2 application), results/11_lipid_correlation_BH.csv (lipogenic-gene correlations), and results/11_marker_panel_QC.csv (Table S1 source data, below).</w:t>
+        <w:t>Full result tables underlying all figures and in-text statistics are available in the code repository (Section 2.8): results/11_axis1_stats_full.csv (axis 1 validation), results/11_MKO_stats_full.csv (axis 2 application), results/11_lipid_correlation_BH.csv (lipogenic-gene correlations), and results/11_marker_panel_QC.csv (Table S1 source data, below). Source data for the external validation analysis (Section 3.5, Figure 5) are in external_validation/results/: gse156057_pct_expr_by_cluster.csv and gse156057_cluster_markers.csv (full FindAllMarkers output, all 40 clusters; Figure 5A), gse156057_S100A8hi_proportions.csv (Figure 5B), and gse166504_pct_expr_by_cluster.csv with gse166504_cluster_vs_authorlabel.csv (Figure 5C).</w:t>
       </w:r>
     </w:p>
     <w:p>
@@ -2991,7 +3001,7 @@
         <w:rPr>
           <w:sz w:val="20"/>
         </w:rPr>
-        <w:t>6. Ritchie ME, Phipson B, Wu D, Hu Y, Law CW, Shi W, Smyth GK. limma powers differential expression analyses for RNA-sequencing and microarray studies. Nucleic Acids Res. 2015;43(7):e47. doi:10.1093/nar/gkv007</w:t>
+        <w:t>6. Benjamini Y, Hochberg Y. Controlling the false discovery rate: a practical and powerful approach to multiple testing. J R Stat Soc Series B. 1995;57(1):289-300.</w:t>
       </w:r>
     </w:p>
     <w:p>
@@ -3003,7 +3013,7 @@
         <w:rPr>
           <w:sz w:val="20"/>
         </w:rPr>
-        <w:t>7. Benjamini Y, Hochberg Y. Controlling the false discovery rate: a practical and powerful approach to multiple testing. J R Stat Soc Series B. 1995;57(1):289-300.</w:t>
+        <w:t>7. Barrett T, Wilhite SE, Ledoux P, et al. NCBI GEO: archive for functional genomics data sets--update. Nucleic Acids Res. 2013;41(D1):D991-D995. doi:10.1093/nar/gks1193</w:t>
       </w:r>
     </w:p>
     <w:p>
@@ -3015,7 +3025,7 @@
         <w:rPr>
           <w:sz w:val="20"/>
         </w:rPr>
-        <w:t>8. Barrett T, Wilhite SE, Ledoux P, et al. NCBI GEO: archive for functional genomics data sets--update. Nucleic Acids Res. 2013;41(D1):D991-D995. doi:10.1093/nar/gks1193</w:t>
+        <w:t>8. McInnes L, Healy J, Melville J. UMAP: Uniform Manifold Approximation and Projection for Dimension Reduction. arXiv:1802.03426 [stat.ML]. 2018.</w:t>
       </w:r>
     </w:p>
     <w:p>
@@ -3027,7 +3037,7 @@
         <w:rPr>
           <w:sz w:val="20"/>
         </w:rPr>
-        <w:t>9. McInnes L, Healy J, Melville J. UMAP: Uniform Manifold Approximation and Projection for Dimension Reduction. arXiv:1802.03426 [stat.ML]. 2018.</w:t>
+        <w:t>9. Su Q, Kim SY, Adewale F, Zhou Y, Aldler C, Ni M, Wei Y, Burczynski ME, Atwal GS, Sleeman MW, Murphy AJ, Xin Y, Cheng X. Single-cell RNA transcriptome landscape of hepatocytes and non-parenchymal cells in healthy and NAFLD mouse liver. iScience. 2021;24(11):103233. doi:10.1016/j.isci.2021.103233</w:t>
       </w:r>
     </w:p>
     <w:p>
@@ -3039,19 +3049,7 @@
         <w:rPr>
           <w:sz w:val="20"/>
         </w:rPr>
-        <w:t>10. Su Q, Kim SY, Adewale F, Zhou Y, Aldler C, Ni M, Wei Y, Burczynski ME, Atwal GS, Sleeman MW, Murphy AJ, Xin Y, Cheng X. Single-cell RNA transcriptome landscape of hepatocytes and non-parenchymal cells in healthy and NAFLD mouse liver. iScience. 2021;24(11):103233. doi:10.1016/j.isci.2021.103233</w:t>
-      </w:r>
-    </w:p>
-    <w:p>
-      <w:pPr>
-        <w:spacing w:after="120" w:line="276" w:lineRule="auto"/>
-        <w:ind w:left="432" w:hanging="432"/>
-      </w:pPr>
-      <w:r>
-        <w:rPr>
-          <w:sz w:val="20"/>
-        </w:rPr>
-        <w:t>11. Remmerie A, Martens L, Thoné T, Castoldi A, Seurinck R, Pavie B, et al. Osteopontin Expression Identifies a Subset of Recruited Macrophages Distinct from Kupffer Cells in the Fatty Liver. Immunity. 2020;53(3):641-657.e14. doi:10.1016/j.immuni.2020.08.004</w:t>
+        <w:t>10. Remmerie A, Martens L, Thoné T, Castoldi A, Seurinck R, Pavie B, et al. Osteopontin Expression Identifies a Subset of Recruited Macrophages Distinct from Kupffer Cells in the Fatty Liver. Immunity. 2020;53(3):641-657.e14. doi:10.1016/j.immuni.2020.08.004</w:t>
       </w:r>
     </w:p>
     <w:sectPr>

</xml_diff>

<commit_message>
Add separate Supplemental Data document with inline manuscript callouts, finalize title
- New supplemental_data.docx (Data S1-S8): full source-data tables for axis-1/axis-2
  deconvolution stats, lipid correlations, and external validation (GSE156057/GSE166504)
  cluster-level results, each with a description of provenance and intended use.
- Main manuscript now cross-references each Data S item inline at the relevant point
  in Results 3.2-3.5, plus an updated Supplementary Materials summary.
- Finalized title: "Cross-Validated Deconvolution Identifies General Hepatic Macrophage
  Burden, Not an S100A8-Hi Subset, as the Lipogenic-Gene Correlate in Mouse MASLD".

Co-Authored-By: Claude Sonnet 5 <noreply@anthropic.com>
</commit_message>
<xml_diff>
--- a/manuscript/manuscript.docx
+++ b/manuscript/manuscript.docx
@@ -12,7 +12,7 @@
           <w:b/>
           <w:sz w:val="32"/>
         </w:rPr>
-        <w:t>Single-Cell-Informed Deconvolution Reveals That General Macrophage Infiltration, Not the S100A8-Hi Subset Specifically, Tracks Lipogenic Gene Expression in a Mouse Model of Steatotic Liver Disease</w:t>
+        <w:t>Cross-Validated Deconvolution Identifies General Hepatic Macrophage Burden, Not an S100A8-Hi Subset, as the Lipogenic-Gene Correlate in Mouse MASLD</w:t>
       </w:r>
     </w:p>
     <w:p>
@@ -1070,7 +1070,16 @@
     </w:p>
     <w:p>
       <w:r>
-        <w:t>In the axis-1 (WT vs Bcl2TG, HFD) validation cohort (n = 5 per group), the Macrophage_Kupffer deconvolution score was significantly higher in WT than TG (Wilcoxon p = 0.012, BH q = 0.024, Cohen's d = -2.86; Figure 2A), matching the direction of every individual macrophage marker gene (Adgre1, Csf1r, Clec4f, Cd68) in the original, fully replicated bulk DESeq2 analysis (Figure 2C). The S100A8hi_macrophage score trended in the same direction (Cohen's d = -0.92) but did not reach significance at this sample size (Wilcoxon p = 0.30, BH q = 0.36; Figure 2B) — consistent with the corresponding single-gene result (S100a8 nominal p = 0.039 but BH-adjusted p = 0.22 in the original n=5-vs-5 DESeq2 analysis). Four additional cell types reached BH q = 0.024 in the same direction as expected for a protective genotype (reduced HFD-associated immune infiltration in Bcl2TG): Dendritic_cell, NK_cell, Stellate_Fibroblast and T_cell; Hepatocyte scored higher in TG than WT (q = 0.024), consistent with proportionally less immune infiltrate diluting the hepatocyte signal in WT.</w:t>
+        <w:t xml:space="preserve">In the axis-1 (WT vs Bcl2TG, HFD) validation cohort (n = 5 per group), the Macrophage_Kupffer deconvolution score was significantly higher in WT than TG (Wilcoxon p = 0.012, BH q = 0.024, Cohen's d = -2.86; Figure 2A), matching the direction of every individual macrophage marker gene (Adgre1, Csf1r, Clec4f, Cd68) in the original, fully replicated bulk DESeq2 analysis (Figure 2C). The S100A8hi_macrophage score trended in the same direction (Cohen's d = -0.92) but did not reach significance at this sample size (Wilcoxon p = 0.30, BH q = 0.36; Figure 2B) — consistent with the corresponding single-gene result (S100a8 nominal p = 0.039 but BH-adjusted p = 0.22 in the original n=5-vs-5 DESeq2 analysis). Four additional cell types reached BH q = 0.024 in the same direction as expected for a protective genotype (reduced HFD-associated immune infiltration in Bcl2TG): Dendritic_cell, NK_cell, Stellate_Fibroblast and T_cell; Hepatocyte scored higher in TG than WT (q = 0.024), consistent with proportionally less immune infiltrate diluting the hepatocyte signal in WT. Full statistics (effect sizes, both tests, both BH-adjusted q-values) for all 12 cell types are provided in </w:t>
+      </w:r>
+      <w:r>
+        <w:rPr>
+          <w:i/>
+        </w:rPr>
+        <w:t>Data S1</w:t>
+      </w:r>
+      <w:r>
+        <w:t xml:space="preserve"> (Supplemental Data), generated from the same analysis that produced Figure 2.</w:t>
       </w:r>
     </w:p>
     <w:p>
@@ -1159,7 +1168,16 @@
         <w:t>≳</w:t>
       </w:r>
       <w:r>
-        <w:t xml:space="preserve"> 2.0-2.4 — larger than the effect sizes observed for either macrophage population, meaning the null result reflects limited power for moderate effects rather than a confirmed absence of any composition change. Two cell types showed nominal, BH-uncorrected effects at exactly the magnitude this design can detect: Neutrophil was lower in MKO (d = -2.42, p = 0.037) and Mast_cell was higher in MKO (d = 2.36, p = 0.037) under HFD (Figure 3E-F); neither survived correction across the 12-cell-type family (q = 0.22) and both require confirmation in an adequately powered cohort before mechanistic interpretation.</w:t>
+        <w:t xml:space="preserve"> 2.0-2.4 — larger than the effect sizes observed for either macrophage population, meaning the null result reflects limited power for moderate effects rather than a confirmed absence of any composition change. Two cell types showed nominal, BH-uncorrected effects at exactly the magnitude this design can detect: Neutrophil was lower in MKO (d = -2.42, p = 0.037) and Mast_cell was higher in MKO (d = 2.36, p = 0.037) under HFD (Figure 3E-F); neither survived correction across the 12-cell-type family (q = 0.22) and both require confirmation in an adequately powered cohort before mechanistic interpretation. Full results for all 12 cell types in both diets, underlying Figure 3, are in </w:t>
+      </w:r>
+      <w:r>
+        <w:rPr>
+          <w:i/>
+        </w:rPr>
+        <w:t>Data S2</w:t>
+      </w:r>
+      <w:r>
+        <w:t xml:space="preserve"> (Supplemental Data).</w:t>
       </w:r>
     </w:p>
     <w:p>
@@ -1239,7 +1257,16 @@
         <w:t>≥</w:t>
       </w:r>
       <w:r>
-        <w:t xml:space="preserve"> 0.42; Cd36: r = 0.11, q = 0.76; Figure 4B-C) — a consistent, reproducible null across the full cohort, within axis 1 alone, and within axis 2 alone.</w:t>
+        <w:t xml:space="preserve"> 0.42; Cd36: r = 0.11, q = 0.76; Figure 4B-C) — a consistent, reproducible null across the full cohort, within axis 1 alone, and within axis 2 alone. Full correlation results for all 30 tests (5 genes x 2 cell types x 3 sample subsets) are in </w:t>
+      </w:r>
+      <w:r>
+        <w:rPr>
+          <w:i/>
+        </w:rPr>
+        <w:t>Data S3</w:t>
+      </w:r>
+      <w:r>
+        <w:t xml:space="preserve"> (Supplemental Data).</w:t>
       </w:r>
     </w:p>
     <w:p>
@@ -2002,7 +2029,25 @@
     </w:p>
     <w:p>
       <w:r>
-        <w:t>In GSE156057 (CD45+-sorted, 77,655 cells, 40 clusters), three clusters matched the S100A8-hi, Ly6g-low criteria (S100a8/S100a9 percent-positive 97-99%, Ly6g/Camp/Ltf/Ngp all &lt; 5%), clearly separated from an unambiguous neutrophil cluster (S100a8/S100a9 100%, Ly6g 89%, Camp 88%, Ltf 80%, Ngp 95%) and from Clec4f-high resident Kupffer clusters (Figure 5A). Combined, these clusters comprised 5.0-7.8% of CD45</w:t>
+        <w:t xml:space="preserve">In GSE156057 (CD45+-sorted, 77,655 cells, 40 clusters), three clusters matched the S100A8-hi, Ly6g-low criteria (S100a8/S100a9 percent-positive 97-99%, Ly6g/Camp/Ltf/Ngp all &lt; 5%), clearly separated from an unambiguous neutrophil cluster (S100a8/S100a9 100%, Ly6g 89%, Camp 88%, Ltf 80%, Ngp 95%) and from Clec4f-high resident Kupffer clusters (Figure 5A; marker profile for all 40 clusters in </w:t>
+      </w:r>
+      <w:r>
+        <w:rPr>
+          <w:i/>
+        </w:rPr>
+        <w:t>Data S4</w:t>
+      </w:r>
+      <w:r>
+        <w:t xml:space="preserve">, top-5 marker genes per cluster in </w:t>
+      </w:r>
+      <w:r>
+        <w:rPr>
+          <w:i/>
+        </w:rPr>
+        <w:t>Data S5</w:t>
+      </w:r>
+      <w:r>
+        <w:t>). Combined, these clusters comprised 5.0-7.8% of CD45</w:t>
       </w:r>
       <w:r>
         <w:rPr>
@@ -2011,7 +2056,34 @@
         <w:t>+</w:t>
       </w:r>
       <w:r>
-        <w:t xml:space="preserve"> cells per sample and were more abundant under western diet (WD) than standard diet (SD) at 12 and 24 weeks (WD/SD ratio 1.45 and 1.21) but not at 36 weeks (ratio 0.81; Figure 5B) — directionally consistent with, though not statistically confirmable given the single-mouse-per-condition design, diet-dependent recruitment. In GSE166504 (whole-liver non-parenchymal cells with true biological replication: chow n = 6, NAFL n = 3, NASH n = 4 mice; 23,198 myeloid cells, 18 clusters), no cluster showed this combination: the only S100a8/S100a9-high cluster also carried high Camp/Ngp/Ltf and was author-labeled Neutrophil, while S100a8 positivity among monocyte/macrophage-lineage clusters varied only as a modest, continuous gradient (6-19%) uncorrelated with Csf1r positivity (Figure 5C) rather than resolving into a discrete population. We interpret this discrepancy as most consistent with immune-cell enrichment (CD45+ sorting, used both in this study's own scRNA-seq reference and in GSE156057) being necessary to resolve this population by unsupervised clustering at typical whole-liver sequencing depth, rather than as evidence that the population is an artifact specific to the single WT/TG reference pair used in the primary analysis (Section 2.2).</w:t>
+        <w:t xml:space="preserve"> cells per sample and were more abundant under western diet (WD) than standard diet (SD) at 12 and 24 weeks (WD/SD ratio 1.45 and 1.21) but not at 36 weeks (ratio 0.81; Figure 5B, full per-sample counts in </w:t>
+      </w:r>
+      <w:r>
+        <w:rPr>
+          <w:i/>
+        </w:rPr>
+        <w:t>Data S6</w:t>
+      </w:r>
+      <w:r>
+        <w:t xml:space="preserve">) — directionally consistent with, though not statistically confirmable given the single-mouse-per-condition design, diet-dependent recruitment. In GSE166504 (whole-liver non-parenchymal cells with true biological replication: chow n = 6, NAFL n = 3, NASH n = 4 mice; 23,198 myeloid cells, 18 clusters), no cluster showed this combination: the only S100a8/S100a9-high cluster also carried high Camp/Ngp/Ltf and was author-labeled Neutrophil, while S100a8 positivity among monocyte/macrophage-lineage clusters varied only as a modest, continuous gradient (6-19%) uncorrelated with Csf1r positivity (Figure 5C; full marker profile for all 18 clusters in </w:t>
+      </w:r>
+      <w:r>
+        <w:rPr>
+          <w:i/>
+        </w:rPr>
+        <w:t>Data S7</w:t>
+      </w:r>
+      <w:r>
+        <w:t xml:space="preserve">, cluster-to-author-label cross-tabulation in </w:t>
+      </w:r>
+      <w:r>
+        <w:rPr>
+          <w:i/>
+        </w:rPr>
+        <w:t>Data S8</w:t>
+      </w:r>
+      <w:r>
+        <w:t>) rather than resolving into a discrete population. We interpret this discrepancy as most consistent with immune-cell enrichment (CD45+ sorting, used both in this study's own scRNA-seq reference and in GSE156057) being necessary to resolve this population by unsupervised clustering at typical whole-liver sequencing depth, rather than as evidence that the population is an artifact specific to the single WT/TG reference pair used in the primary analysis (Section 2.2).</w:t>
       </w:r>
     </w:p>
     <w:p>
@@ -2304,7 +2376,88 @@
     </w:p>
     <w:p>
       <w:r>
-        <w:t>Full result tables underlying all figures and in-text statistics are available in the code repository (Section 2.8): results/11_axis1_stats_full.csv (axis 1 validation), results/11_MKO_stats_full.csv (axis 2 application), results/11_lipid_correlation_BH.csv (lipogenic-gene correlations), and results/11_marker_panel_QC.csv (Table S1 source data, below). Source data for the external validation analysis (Section 3.5, Figure 5) are in external_validation/results/: gse156057_pct_expr_by_cluster.csv and gse156057_cluster_markers.csv (full FindAllMarkers output, all 40 clusters; Figure 5A), gse156057_S100A8hi_proportions.csv (Figure 5B), and gse166504_pct_expr_by_cluster.csv with gse166504_cluster_vs_authorlabel.csv (Figure 5C).</w:t>
+        <w:t xml:space="preserve">Full result tables underlying all figures and in-text statistics are reported in a separate document, </w:t>
+      </w:r>
+      <w:r>
+        <w:rPr>
+          <w:i/>
+        </w:rPr>
+        <w:t>Supplemental Data (Data S1-S8)</w:t>
+      </w:r>
+      <w:r>
+        <w:t xml:space="preserve">, accompanying this manuscript: </w:t>
+      </w:r>
+      <w:r>
+        <w:rPr>
+          <w:i/>
+        </w:rPr>
+        <w:t>Data S1</w:t>
+      </w:r>
+      <w:r>
+        <w:t xml:space="preserve"> (full axis-1 deconvolution statistics, all 12 cell types), </w:t>
+      </w:r>
+      <w:r>
+        <w:rPr>
+          <w:i/>
+        </w:rPr>
+        <w:t>Data S2</w:t>
+      </w:r>
+      <w:r>
+        <w:t xml:space="preserve"> (full axis-2/MKO statistics), </w:t>
+      </w:r>
+      <w:r>
+        <w:rPr>
+          <w:i/>
+        </w:rPr>
+        <w:t>Data S3</w:t>
+      </w:r>
+      <w:r>
+        <w:t xml:space="preserve"> (full lipogenic-gene correlation statistics), </w:t>
+      </w:r>
+      <w:r>
+        <w:rPr>
+          <w:i/>
+        </w:rPr>
+        <w:t>Data S4</w:t>
+      </w:r>
+      <w:r>
+        <w:t xml:space="preserve"> (GSE156057 marker-gene percent-positive by cluster, all 40 clusters), </w:t>
+      </w:r>
+      <w:r>
+        <w:rPr>
+          <w:i/>
+        </w:rPr>
+        <w:t>Data S5</w:t>
+      </w:r>
+      <w:r>
+        <w:t xml:space="preserve"> (GSE156057 top-5 marker genes per cluster), </w:t>
+      </w:r>
+      <w:r>
+        <w:rPr>
+          <w:i/>
+        </w:rPr>
+        <w:t>Data S6</w:t>
+      </w:r>
+      <w:r>
+        <w:t xml:space="preserve"> (GSE156057 S100A8-hi cluster proportions by diet/timepoint), </w:t>
+      </w:r>
+      <w:r>
+        <w:rPr>
+          <w:i/>
+        </w:rPr>
+        <w:t>Data S7</w:t>
+      </w:r>
+      <w:r>
+        <w:t xml:space="preserve"> (GSE166504 marker-gene percent-positive by cluster, all 18 clusters), and </w:t>
+      </w:r>
+      <w:r>
+        <w:rPr>
+          <w:i/>
+        </w:rPr>
+        <w:t>Data S8</w:t>
+      </w:r>
+      <w:r>
+        <w:t xml:space="preserve"> (GSE166504 cluster-to-author-label cross-tabulation). Each Data S item states its source CSV and generating script for full reproducibility. The underlying raw CSV files are also available directly in the code repository (Section 2.8): results/11_axis1_stats_full.csv, results/11_MKO_stats_full.csv, results/11_lipid_correlation_BH.csv, results/11_marker_panel_QC.csv (Table S1 source data, below), and external_validation/results/*.csv.</w:t>
       </w:r>
     </w:p>
     <w:p>

</xml_diff>